<commit_message>
Update DTT02.docx template and fix font weight formatting
</commit_message>
<xml_diff>
--- a/public/templates/DTT02.docx
+++ b/public/templates/DTT02.docx
@@ -1,6 +1,6 @@
 
 <file path=word/document.xml><?xml version="1.0" encoding="utf-8"?>
-<w:document xmlns:wpc="http://schemas.microsoft.com/office/word/2010/wordprocessingCanvas" xmlns:cx="http://schemas.microsoft.com/office/drawing/2014/chartex" xmlns:cx1="http://schemas.microsoft.com/office/drawing/2015/9/8/chartex" xmlns:cx2="http://schemas.microsoft.com/office/drawing/2015/10/21/chartex" xmlns:cx3="http://schemas.microsoft.com/office/drawing/2016/5/9/chartex" xmlns:cx4="http://schemas.microsoft.com/office/drawing/2016/5/10/chartex" xmlns:cx5="http://schemas.microsoft.com/office/drawing/2016/5/11/chartex" xmlns:cx6="http://schemas.microsoft.com/office/drawing/2016/5/12/chartex" xmlns:cx7="http://schemas.microsoft.com/office/drawing/2016/5/13/chartex" xmlns:cx8="http://schemas.microsoft.com/office/drawing/2016/5/14/chartex" xmlns:mc="http://schemas.openxmlformats.org/markup-compatibility/2006" xmlns:aink="http://schemas.microsoft.com/office/drawing/2016/ink" xmlns:am3d="http://schemas.microsoft.com/office/drawing/2017/model3d" xmlns:o="urn:schemas-microsoft-com:office:office" xmlns:oel="http://schemas.microsoft.com/office/2019/extlst" xmlns:r="http://schemas.openxmlformats.org/officeDocument/2006/relationships" xmlns:m="http://schemas.openxmlformats.org/officeDocument/2006/math" xmlns:v="urn:schemas-microsoft-com:vml" xmlns:wp14="http://schemas.microsoft.com/office/word/2010/wordprocessingDrawing" xmlns:wp="http://schemas.openxmlformats.org/drawingml/2006/wordprocessingDrawing" xmlns:w10="urn:schemas-microsoft-com:office:word" xmlns:w="http://schemas.openxmlformats.org/wordprocessingml/2006/main" xmlns:w14="http://schemas.microsoft.com/office/word/2010/wordml" xmlns:w15="http://schemas.microsoft.com/office/word/2012/wordml" xmlns:w16cex="http://schemas.microsoft.com/office/word/2018/wordml/cex" xmlns:w16cid="http://schemas.microsoft.com/office/word/2016/wordml/cid" xmlns:w16="http://schemas.microsoft.com/office/word/2018/wordml" xmlns:w16du="http://schemas.microsoft.com/office/word/2023/wordml/word16du" xmlns:w16sdtdh="http://schemas.microsoft.com/office/word/2020/wordml/sdtdatahash" xmlns:w16sdtfl="http://schemas.microsoft.com/office/word/2024/wordml/sdtformatlock" xmlns:w16se="http://schemas.microsoft.com/office/word/2015/wordml/symex" xmlns:wpg="http://schemas.microsoft.com/office/word/2010/wordprocessingGroup" xmlns:wpi="http://schemas.microsoft.com/office/word/2010/wordprocessingInk" xmlns:wne="http://schemas.microsoft.com/office/word/2006/wordml" xmlns:wps="http://schemas.microsoft.com/office/word/2010/wordprocessingShape" mc:Ignorable="w14 w15 w16se w16cid w16 w16cex w16sdtdh w16sdtfl w16du wp14">
+<w:document xmlns:wpc="http://schemas.microsoft.com/office/word/2010/wordprocessingCanvas" xmlns:cx="http://schemas.microsoft.com/office/drawing/2014/chartex" xmlns:cx1="http://schemas.microsoft.com/office/drawing/2015/9/8/chartex" xmlns:cx2="http://schemas.microsoft.com/office/drawing/2015/10/21/chartex" xmlns:cx3="http://schemas.microsoft.com/office/drawing/2016/5/9/chartex" xmlns:cx4="http://schemas.microsoft.com/office/drawing/2016/5/10/chartex" xmlns:cx5="http://schemas.microsoft.com/office/drawing/2016/5/11/chartex" xmlns:cx6="http://schemas.microsoft.com/office/drawing/2016/5/12/chartex" xmlns:cx7="http://schemas.microsoft.com/office/drawing/2016/5/13/chartex" xmlns:cx8="http://schemas.microsoft.com/office/drawing/2016/5/14/chartex" xmlns:mc="http://schemas.openxmlformats.org/markup-compatibility/2006" xmlns:aink="http://schemas.microsoft.com/office/drawing/2016/ink" xmlns:am3d="http://schemas.microsoft.com/office/drawing/2017/model3d" xmlns:o="urn:schemas-microsoft-com:office:office" xmlns:oel="http://schemas.microsoft.com/office/2019/extlst" xmlns:r="http://schemas.openxmlformats.org/officeDocument/2006/relationships" xmlns:m="http://schemas.openxmlformats.org/officeDocument/2006/math" xmlns:v="urn:schemas-microsoft-com:vml" xmlns:wp14="http://schemas.microsoft.com/office/word/2010/wordprocessingDrawing" xmlns:wp="http://schemas.openxmlformats.org/drawingml/2006/wordprocessingDrawing" xmlns:w10="urn:schemas-microsoft-com:office:word" xmlns:w="http://schemas.openxmlformats.org/wordprocessingml/2006/main" xmlns:w14="http://schemas.microsoft.com/office/word/2010/wordml" xmlns:w15="http://schemas.microsoft.com/office/word/2012/wordml" xmlns:w16cei="http://schemas.microsoft.com/office/word/2026/wordml/cei" xmlns:w16cex="http://schemas.microsoft.com/office/word/2018/wordml/cex" xmlns:w16cid="http://schemas.microsoft.com/office/word/2016/wordml/cid" xmlns:w16="http://schemas.microsoft.com/office/word/2018/wordml" xmlns:w16du="http://schemas.microsoft.com/office/word/2023/wordml/word16du" xmlns:w16sdtdh="http://schemas.microsoft.com/office/word/2020/wordml/sdtdatahash" xmlns:w16sdtfl="http://schemas.microsoft.com/office/word/2024/wordml/sdtformatlock" xmlns:w16se="http://schemas.microsoft.com/office/word/2015/wordml/symex" xmlns:wpg="http://schemas.microsoft.com/office/word/2010/wordprocessingGroup" xmlns:wpi="http://schemas.microsoft.com/office/word/2010/wordprocessingInk" xmlns:wne="http://schemas.microsoft.com/office/word/2006/wordml" xmlns:wps="http://schemas.microsoft.com/office/word/2010/wordprocessingShape" mc:Ignorable="w14 w15 w16se w16cid w16 w16cex w16sdtdh w16sdtfl w16du wp14">
   <w:body>
     <w:p>
       <w:pPr>
@@ -265,9 +265,7 @@
       </w:tblPr>
       <w:tblGrid>
         <w:gridCol w:w="2263"/>
-        <w:gridCol w:w="2552"/>
-        <w:gridCol w:w="992"/>
-        <w:gridCol w:w="709"/>
+        <w:gridCol w:w="4253"/>
         <w:gridCol w:w="840"/>
         <w:gridCol w:w="719"/>
         <w:gridCol w:w="110"/>
@@ -325,7 +323,7 @@
         <w:tc>
           <w:tcPr>
             <w:tcW w:w="5093" w:type="dxa"/>
-            <w:gridSpan w:val="4"/>
+            <w:gridSpan w:val="2"/>
           </w:tcPr>
           <w:p>
             <w:pPr>
@@ -500,7 +498,7 @@
         <w:tc>
           <w:tcPr>
             <w:tcW w:w="7931" w:type="dxa"/>
-            <w:gridSpan w:val="7"/>
+            <w:gridSpan w:val="5"/>
           </w:tcPr>
           <w:p>
             <w:pPr>
@@ -532,15 +530,6 @@
           </w:tcPr>
           <w:p>
             <w:pPr>
-              <w:rPr>
-                <w:rFonts w:ascii="TH SarabunPSK" w:hAnsi="TH SarabunPSK" w:cs="TH SarabunPSK"/>
-                <w:b/>
-                <w:bCs/>
-                <w:sz w:val="28"/>
-                <w:szCs w:val="28"/>
-              </w:rPr>
-            </w:pPr>
-            <w:r>
               <w:rPr>
                 <w:rFonts w:ascii="TH SarabunPSK" w:hAnsi="TH SarabunPSK" w:cs="TH SarabunPSK" w:hint="cs"/>
                 <w:b/>
@@ -549,59 +538,6 @@
                 <w:szCs w:val="28"/>
                 <w:cs/>
               </w:rPr>
-              <w:t xml:space="preserve">อำเภอ </w:t>
-            </w:r>
-            <w:r>
-              <w:rPr>
-                <w:rFonts w:ascii="TH SarabunPSK" w:hAnsi="TH SarabunPSK" w:cs="TH SarabunPSK"/>
-                <w:b/>
-                <w:bCs/>
-                <w:sz w:val="28"/>
-                <w:szCs w:val="28"/>
-              </w:rPr>
-              <w:t>:</w:t>
-            </w:r>
-          </w:p>
-        </w:tc>
-        <w:tc>
-          <w:tcPr>
-            <w:tcW w:w="2552" w:type="dxa"/>
-          </w:tcPr>
-          <w:p>
-            <w:pPr>
-              <w:rPr>
-                <w:rFonts w:ascii="TH SarabunPSK" w:hAnsi="TH SarabunPSK" w:cs="TH SarabunPSK"/>
-                <w:color w:val="EE0000"/>
-                <w:sz w:val="28"/>
-                <w:szCs w:val="28"/>
-                <w:cs/>
-              </w:rPr>
-            </w:pPr>
-            <w:r>
-              <w:rPr>
-                <w:rFonts w:ascii="TH SarabunPSK" w:hAnsi="TH SarabunPSK" w:cs="TH SarabunPSK" w:hint="cs"/>
-                <w:color w:val="EE0000"/>
-                <w:sz w:val="28"/>
-                <w:szCs w:val="28"/>
-                <w:cs/>
-              </w:rPr>
-              <w:t>น้ำหนาว</w:t>
-            </w:r>
-          </w:p>
-        </w:tc>
-        <w:tc>
-          <w:tcPr>
-            <w:tcW w:w="992" w:type="dxa"/>
-          </w:tcPr>
-          <w:p>
-            <w:pPr>
-              <w:rPr>
-                <w:rFonts w:ascii="TH SarabunPSK" w:hAnsi="TH SarabunPSK" w:cs="TH SarabunPSK"/>
-                <w:b/>
-                <w:bCs/>
-                <w:sz w:val="28"/>
-                <w:szCs w:val="28"/>
-              </w:rPr>
             </w:pPr>
             <w:r>
               <w:rPr>
@@ -628,8 +564,36 @@
         </w:tc>
         <w:tc>
           <w:tcPr>
-            <w:tcW w:w="4387" w:type="dxa"/>
+            <w:tcW w:w="7931" w:type="dxa"/>
             <w:gridSpan w:val="5"/>
+          </w:tcPr>
+          <w:p>
+            <w:pPr>
+              <w:rPr>
+                <w:rFonts w:ascii="TH SarabunPSK" w:hAnsi="TH SarabunPSK" w:cs="TH SarabunPSK" w:hint="cs"/>
+                <w:color w:val="EE0000"/>
+                <w:sz w:val="28"/>
+                <w:szCs w:val="28"/>
+                <w:cs/>
+              </w:rPr>
+            </w:pPr>
+            <w:r>
+              <w:rPr>
+                <w:rFonts w:ascii="TH SarabunPSK" w:hAnsi="TH SarabunPSK" w:cs="TH SarabunPSK" w:hint="cs"/>
+                <w:color w:val="EE0000"/>
+                <w:sz w:val="28"/>
+                <w:szCs w:val="28"/>
+                <w:cs/>
+              </w:rPr>
+              <w:t>อุบลราชธานี</w:t>
+            </w:r>
+          </w:p>
+        </w:tc>
+      </w:tr>
+      <w:tr>
+        <w:tc>
+          <w:tcPr>
+            <w:tcW w:w="2263" w:type="dxa"/>
           </w:tcPr>
           <w:p>
             <w:pPr>
@@ -646,12 +610,48 @@
                 <w:rFonts w:ascii="TH SarabunPSK" w:hAnsi="TH SarabunPSK" w:cs="TH SarabunPSK" w:hint="cs"/>
                 <w:b/>
                 <w:bCs/>
+                <w:sz w:val="28"/>
+                <w:szCs w:val="28"/>
+                <w:cs/>
+              </w:rPr>
+              <w:t xml:space="preserve">ชื่อผู้ดูแลศูนย์ </w:t>
+            </w:r>
+            <w:r>
+              <w:rPr>
+                <w:rFonts w:ascii="TH SarabunPSK" w:hAnsi="TH SarabunPSK" w:cs="TH SarabunPSK"/>
+                <w:b/>
+                <w:bCs/>
+                <w:sz w:val="28"/>
+                <w:szCs w:val="28"/>
+              </w:rPr>
+              <w:t>:</w:t>
+            </w:r>
+          </w:p>
+        </w:tc>
+        <w:tc>
+          <w:tcPr>
+            <w:tcW w:w="7931" w:type="dxa"/>
+            <w:gridSpan w:val="5"/>
+          </w:tcPr>
+          <w:p>
+            <w:pPr>
+              <w:rPr>
+                <w:rFonts w:ascii="TH SarabunPSK" w:hAnsi="TH SarabunPSK" w:cs="TH SarabunPSK"/>
+                <w:b/>
+                <w:bCs/>
+                <w:sz w:val="28"/>
+                <w:szCs w:val="28"/>
+              </w:rPr>
+            </w:pPr>
+            <w:r>
+              <w:rPr>
+                <w:rFonts w:ascii="TH SarabunPSK" w:hAnsi="TH SarabunPSK" w:cs="TH SarabunPSK" w:hint="cs"/>
                 <w:color w:val="EE0000"/>
                 <w:sz w:val="28"/>
                 <w:szCs w:val="28"/>
                 <w:cs/>
               </w:rPr>
-              <w:t>อุบลราชธานี</w:t>
+              <w:t>นายเกษม สันต์กำแพง</w:t>
             </w:r>
           </w:p>
         </w:tc>
@@ -680,7 +680,7 @@
                 <w:szCs w:val="28"/>
                 <w:cs/>
               </w:rPr>
-              <w:t xml:space="preserve">ชื่อผู้ดูแลศูนย์ </w:t>
+              <w:t xml:space="preserve">อีเมล </w:t>
             </w:r>
             <w:r>
               <w:rPr>
@@ -696,8 +696,32 @@
         </w:tc>
         <w:tc>
           <w:tcPr>
-            <w:tcW w:w="7931" w:type="dxa"/>
-            <w:gridSpan w:val="7"/>
+            <w:tcW w:w="4253" w:type="dxa"/>
+          </w:tcPr>
+          <w:p>
+            <w:pPr>
+              <w:rPr>
+                <w:rFonts w:ascii="TH SarabunPSK" w:hAnsi="TH SarabunPSK" w:cs="TH SarabunPSK"/>
+                <w:color w:val="EE0000"/>
+                <w:sz w:val="28"/>
+                <w:szCs w:val="28"/>
+              </w:rPr>
+            </w:pPr>
+            <w:r>
+              <w:rPr>
+                <w:rFonts w:ascii="TH SarabunPSK" w:hAnsi="TH SarabunPSK" w:cs="TH SarabunPSK"/>
+                <w:color w:val="EE0000"/>
+                <w:sz w:val="28"/>
+                <w:szCs w:val="28"/>
+              </w:rPr>
+              <w:t>Budgethotel@gmail.com</w:t>
+            </w:r>
+          </w:p>
+        </w:tc>
+        <w:tc>
+          <w:tcPr>
+            <w:tcW w:w="1559" w:type="dxa"/>
+            <w:gridSpan w:val="2"/>
           </w:tcPr>
           <w:p>
             <w:pPr>
@@ -711,32 +735,15 @@
             </w:pPr>
             <w:r>
               <w:rPr>
-                <w:rFonts w:ascii="TH SarabunPSK" w:hAnsi="TH SarabunPSK" w:cs="TH SarabunPSK" w:hint="cs"/>
-                <w:color w:val="EE0000"/>
-                <w:sz w:val="28"/>
-                <w:szCs w:val="28"/>
-                <w:cs/>
-              </w:rPr>
-              <w:t>นายเกษม สันต์กำแพง</w:t>
-            </w:r>
-          </w:p>
-        </w:tc>
-      </w:tr>
-      <w:tr>
-        <w:tc>
-          <w:tcPr>
-            <w:tcW w:w="2263" w:type="dxa"/>
-          </w:tcPr>
-          <w:p>
-            <w:pPr>
-              <w:rPr>
                 <w:rFonts w:ascii="TH SarabunPSK" w:hAnsi="TH SarabunPSK" w:cs="TH SarabunPSK"/>
                 <w:b/>
                 <w:bCs/>
                 <w:sz w:val="28"/>
                 <w:szCs w:val="28"/>
-              </w:rPr>
-            </w:pPr>
+                <w:cs/>
+              </w:rPr>
+              <w:t>เบอร์โทรศัพท์</w:t>
+            </w:r>
             <w:r>
               <w:rPr>
                 <w:rFonts w:ascii="TH SarabunPSK" w:hAnsi="TH SarabunPSK" w:cs="TH SarabunPSK" w:hint="cs"/>
@@ -746,7 +753,7 @@
                 <w:szCs w:val="28"/>
                 <w:cs/>
               </w:rPr>
-              <w:t xml:space="preserve">อีเมล </w:t>
+              <w:t xml:space="preserve"> </w:t>
             </w:r>
             <w:r>
               <w:rPr>
@@ -762,80 +769,6 @@
         </w:tc>
         <w:tc>
           <w:tcPr>
-            <w:tcW w:w="4253" w:type="dxa"/>
-            <w:gridSpan w:val="3"/>
-          </w:tcPr>
-          <w:p>
-            <w:pPr>
-              <w:rPr>
-                <w:rFonts w:ascii="TH SarabunPSK" w:hAnsi="TH SarabunPSK" w:cs="TH SarabunPSK"/>
-                <w:color w:val="EE0000"/>
-                <w:sz w:val="28"/>
-                <w:szCs w:val="28"/>
-              </w:rPr>
-            </w:pPr>
-            <w:r>
-              <w:rPr>
-                <w:rFonts w:ascii="TH SarabunPSK" w:hAnsi="TH SarabunPSK" w:cs="TH SarabunPSK"/>
-                <w:color w:val="EE0000"/>
-                <w:sz w:val="28"/>
-                <w:szCs w:val="28"/>
-              </w:rPr>
-              <w:t>Budgethotel@gmail.com</w:t>
-            </w:r>
-          </w:p>
-        </w:tc>
-        <w:tc>
-          <w:tcPr>
-            <w:tcW w:w="1559" w:type="dxa"/>
-            <w:gridSpan w:val="2"/>
-          </w:tcPr>
-          <w:p>
-            <w:pPr>
-              <w:rPr>
-                <w:rFonts w:ascii="TH SarabunPSK" w:hAnsi="TH SarabunPSK" w:cs="TH SarabunPSK"/>
-                <w:b/>
-                <w:bCs/>
-                <w:sz w:val="28"/>
-                <w:szCs w:val="28"/>
-              </w:rPr>
-            </w:pPr>
-            <w:r>
-              <w:rPr>
-                <w:rFonts w:ascii="TH SarabunPSK" w:hAnsi="TH SarabunPSK" w:cs="TH SarabunPSK"/>
-                <w:b/>
-                <w:bCs/>
-                <w:sz w:val="28"/>
-                <w:szCs w:val="28"/>
-                <w:cs/>
-              </w:rPr>
-              <w:t>เบอร์โทรศัพท์</w:t>
-            </w:r>
-            <w:r>
-              <w:rPr>
-                <w:rFonts w:ascii="TH SarabunPSK" w:hAnsi="TH SarabunPSK" w:cs="TH SarabunPSK" w:hint="cs"/>
-                <w:b/>
-                <w:bCs/>
-                <w:sz w:val="28"/>
-                <w:szCs w:val="28"/>
-                <w:cs/>
-              </w:rPr>
-              <w:t xml:space="preserve"> </w:t>
-            </w:r>
-            <w:r>
-              <w:rPr>
-                <w:rFonts w:ascii="TH SarabunPSK" w:hAnsi="TH SarabunPSK" w:cs="TH SarabunPSK"/>
-                <w:b/>
-                <w:bCs/>
-                <w:sz w:val="28"/>
-                <w:szCs w:val="28"/>
-              </w:rPr>
-              <w:t>:</w:t>
-            </w:r>
-          </w:p>
-        </w:tc>
-        <w:tc>
-          <w:tcPr>
             <w:tcW w:w="2119" w:type="dxa"/>
             <w:gridSpan w:val="2"/>
           </w:tcPr>
@@ -843,8 +776,6 @@
             <w:pPr>
               <w:rPr>
                 <w:rFonts w:ascii="TH SarabunPSK" w:hAnsi="TH SarabunPSK" w:cs="TH SarabunPSK"/>
-                <w:b/>
-                <w:bCs/>
                 <w:sz w:val="28"/>
                 <w:szCs w:val="28"/>
               </w:rPr>
@@ -852,8 +783,6 @@
             <w:r>
               <w:rPr>
                 <w:rFonts w:ascii="TH SarabunPSK" w:hAnsi="TH SarabunPSK" w:cs="TH SarabunPSK" w:hint="cs"/>
-                <w:b/>
-                <w:bCs/>
                 <w:color w:val="EE0000"/>
                 <w:sz w:val="28"/>
                 <w:szCs w:val="28"/>
@@ -3744,7 +3673,7 @@
     <w:p>
       <w:pPr>
         <w:rPr>
-          <w:rFonts w:ascii="TH SarabunPSK" w:hAnsi="TH SarabunPSK" w:cs="TH SarabunPSK" w:hint="cs"/>
+          <w:rFonts w:ascii="TH SarabunPSK" w:hAnsi="TH SarabunPSK" w:cs="TH SarabunPSK"/>
           <w:sz w:val="28"/>
           <w:szCs w:val="28"/>
           <w:cs/>
@@ -3982,7 +3911,7 @@
 </file>
 
 <file path=word/numbering.xml><?xml version="1.0" encoding="utf-8"?>
-<w:numbering xmlns:wpc="http://schemas.microsoft.com/office/word/2010/wordprocessingCanvas" xmlns:cx="http://schemas.microsoft.com/office/drawing/2014/chartex" xmlns:cx1="http://schemas.microsoft.com/office/drawing/2015/9/8/chartex" xmlns:cx2="http://schemas.microsoft.com/office/drawing/2015/10/21/chartex" xmlns:cx3="http://schemas.microsoft.com/office/drawing/2016/5/9/chartex" xmlns:cx4="http://schemas.microsoft.com/office/drawing/2016/5/10/chartex" xmlns:cx5="http://schemas.microsoft.com/office/drawing/2016/5/11/chartex" xmlns:cx6="http://schemas.microsoft.com/office/drawing/2016/5/12/chartex" xmlns:cx7="http://schemas.microsoft.com/office/drawing/2016/5/13/chartex" xmlns:cx8="http://schemas.microsoft.com/office/drawing/2016/5/14/chartex" xmlns:mc="http://schemas.openxmlformats.org/markup-compatibility/2006" xmlns:aink="http://schemas.microsoft.com/office/drawing/2016/ink" xmlns:am3d="http://schemas.microsoft.com/office/drawing/2017/model3d" xmlns:o="urn:schemas-microsoft-com:office:office" xmlns:oel="http://schemas.microsoft.com/office/2019/extlst" xmlns:r="http://schemas.openxmlformats.org/officeDocument/2006/relationships" xmlns:m="http://schemas.openxmlformats.org/officeDocument/2006/math" xmlns:v="urn:schemas-microsoft-com:vml" xmlns:wp14="http://schemas.microsoft.com/office/word/2010/wordprocessingDrawing" xmlns:wp="http://schemas.openxmlformats.org/drawingml/2006/wordprocessingDrawing" xmlns:w10="urn:schemas-microsoft-com:office:word" xmlns:w="http://schemas.openxmlformats.org/wordprocessingml/2006/main" xmlns:w14="http://schemas.microsoft.com/office/word/2010/wordml" xmlns:w15="http://schemas.microsoft.com/office/word/2012/wordml" xmlns:w16cex="http://schemas.microsoft.com/office/word/2018/wordml/cex" xmlns:w16cid="http://schemas.microsoft.com/office/word/2016/wordml/cid" xmlns:w16="http://schemas.microsoft.com/office/word/2018/wordml" xmlns:w16du="http://schemas.microsoft.com/office/word/2023/wordml/word16du" xmlns:w16sdtdh="http://schemas.microsoft.com/office/word/2020/wordml/sdtdatahash" xmlns:w16sdtfl="http://schemas.microsoft.com/office/word/2024/wordml/sdtformatlock" xmlns:w16se="http://schemas.microsoft.com/office/word/2015/wordml/symex" xmlns:wpg="http://schemas.microsoft.com/office/word/2010/wordprocessingGroup" xmlns:wpi="http://schemas.microsoft.com/office/word/2010/wordprocessingInk" xmlns:wne="http://schemas.microsoft.com/office/word/2006/wordml" xmlns:wps="http://schemas.microsoft.com/office/word/2010/wordprocessingShape" mc:Ignorable="w14 w15 w16se w16cid w16 w16cex w16sdtdh w16sdtfl w16du wp14">
+<w:numbering xmlns:wpc="http://schemas.microsoft.com/office/word/2010/wordprocessingCanvas" xmlns:cx="http://schemas.microsoft.com/office/drawing/2014/chartex" xmlns:cx1="http://schemas.microsoft.com/office/drawing/2015/9/8/chartex" xmlns:cx2="http://schemas.microsoft.com/office/drawing/2015/10/21/chartex" xmlns:cx3="http://schemas.microsoft.com/office/drawing/2016/5/9/chartex" xmlns:cx4="http://schemas.microsoft.com/office/drawing/2016/5/10/chartex" xmlns:cx5="http://schemas.microsoft.com/office/drawing/2016/5/11/chartex" xmlns:cx6="http://schemas.microsoft.com/office/drawing/2016/5/12/chartex" xmlns:cx7="http://schemas.microsoft.com/office/drawing/2016/5/13/chartex" xmlns:cx8="http://schemas.microsoft.com/office/drawing/2016/5/14/chartex" xmlns:mc="http://schemas.openxmlformats.org/markup-compatibility/2006" xmlns:aink="http://schemas.microsoft.com/office/drawing/2016/ink" xmlns:am3d="http://schemas.microsoft.com/office/drawing/2017/model3d" xmlns:o="urn:schemas-microsoft-com:office:office" xmlns:oel="http://schemas.microsoft.com/office/2019/extlst" xmlns:r="http://schemas.openxmlformats.org/officeDocument/2006/relationships" xmlns:m="http://schemas.openxmlformats.org/officeDocument/2006/math" xmlns:v="urn:schemas-microsoft-com:vml" xmlns:wp14="http://schemas.microsoft.com/office/word/2010/wordprocessingDrawing" xmlns:wp="http://schemas.openxmlformats.org/drawingml/2006/wordprocessingDrawing" xmlns:w10="urn:schemas-microsoft-com:office:word" xmlns:w="http://schemas.openxmlformats.org/wordprocessingml/2006/main" xmlns:w14="http://schemas.microsoft.com/office/word/2010/wordml" xmlns:w15="http://schemas.microsoft.com/office/word/2012/wordml" xmlns:w16cei="http://schemas.microsoft.com/office/word/2026/wordml/cei" xmlns:w16cex="http://schemas.microsoft.com/office/word/2018/wordml/cex" xmlns:w16cid="http://schemas.microsoft.com/office/word/2016/wordml/cid" xmlns:w16="http://schemas.microsoft.com/office/word/2018/wordml" xmlns:w16du="http://schemas.microsoft.com/office/word/2023/wordml/word16du" xmlns:w16sdtdh="http://schemas.microsoft.com/office/word/2020/wordml/sdtdatahash" xmlns:w16sdtfl="http://schemas.microsoft.com/office/word/2024/wordml/sdtformatlock" xmlns:w16se="http://schemas.microsoft.com/office/word/2015/wordml/symex" xmlns:wpg="http://schemas.microsoft.com/office/word/2010/wordprocessingGroup" xmlns:wpi="http://schemas.microsoft.com/office/word/2010/wordprocessingInk" xmlns:wne="http://schemas.microsoft.com/office/word/2006/wordml" xmlns:wps="http://schemas.microsoft.com/office/word/2010/wordprocessingShape" mc:Ignorable="w14 w15 w16se w16cid w16 w16cex w16sdtdh w16sdtfl w16du wp14">
   <w:abstractNum w:abstractNumId="0" w15:restartNumberingAfterBreak="0">
     <w:nsid w:val="65E54A3D"/>
     <w:multiLevelType w:val="hybridMultilevel"/>
@@ -4681,6 +4610,7 @@
   <w:style w:type="character" w:default="1" w:styleId="DefaultParagraphFont">
     <w:name w:val="Default Paragraph Font"/>
     <w:uiPriority w:val="1"/>
+    <w:semiHidden/>
     <w:unhideWhenUsed/>
   </w:style>
   <w:style w:type="table" w:default="1" w:styleId="TableNormal">

</xml_diff>